<commit_message>
Fill in the live app address in the guides and manual
- Guides rebuilt for https://sensoria-attendance.kinmenglim.workers.dev
- Links table: merge the "who" column so each link fits on one line

Co-Authored-By: Claude Opus 5.5 <noreply@anthropic.com>
Claude-Session: https://claude.ai/code/session_01V3VPa54o7JJrawHahhGPiS
</commit_message>
<xml_diff>
--- a/docs/Admin-Guide.docx
+++ b/docs/Admin-Guide.docx
@@ -62,9 +62,8 @@
         </w:tblBorders>
       </w:tblPr>
       <w:tblGrid>
-        <w:gridCol w:w="4048"/>
-        <w:gridCol w:w="4144"/>
-        <w:gridCol w:w="1446"/>
+        <w:gridCol w:w="3470"/>
+        <w:gridCol w:w="6168"/>
       </w:tblGrid>
       <w:tr>
         <w:trPr>
@@ -73,7 +72,7 @@
         </w:trPr>
         <w:tc>
           <w:tcPr>
-            <w:tcW w:type="dxa" w:w="4048"/>
+            <w:tcW w:type="dxa" w:w="3470"/>
             <w:tcBorders>
               <w:top w:val="single" w:color="D5DCE2" w:sz="4"/>
               <w:left w:val="single" w:color="D5DCE2" w:sz="4"/>
@@ -100,7 +99,7 @@
         </w:tc>
         <w:tc>
           <w:tcPr>
-            <w:tcW w:type="dxa" w:w="4144"/>
+            <w:tcW w:type="dxa" w:w="6168"/>
             <w:tcBorders>
               <w:top w:val="single" w:color="D5DCE2" w:sz="4"/>
               <w:left w:val="single" w:color="D5DCE2" w:sz="4"/>
@@ -122,33 +121,6 @@
                 <w:bCs/>
               </w:rPr>
               <w:t xml:space="preserve">Link</w:t>
-            </w:r>
-          </w:p>
-        </w:tc>
-        <w:tc>
-          <w:tcPr>
-            <w:tcW w:type="dxa" w:w="1446"/>
-            <w:tcBorders>
-              <w:top w:val="single" w:color="D5DCE2" w:sz="4"/>
-              <w:left w:val="single" w:color="D5DCE2" w:sz="4"/>
-              <w:bottom w:val="single" w:color="D5DCE2" w:sz="4"/>
-              <w:right w:val="single" w:color="D5DCE2" w:sz="4"/>
-            </w:tcBorders>
-            <w:shd w:fill="E6F2F1" w:color="auto" w:val="clear"/>
-            <w:tcMar>
-              <w:top w:type="dxa" w:w="70"/>
-              <w:left w:type="dxa" w:w="110"/>
-              <w:bottom w:type="dxa" w:w="70"/>
-              <w:right w:type="dxa" w:w="110"/>
-            </w:tcMar>
-          </w:tcPr>
-          <w:p>
-            <w:r>
-              <w:rPr>
-                <w:b/>
-                <w:bCs/>
-              </w:rPr>
-              <w:t xml:space="preserve">Who</w:t>
             </w:r>
           </w:p>
         </w:tc>
@@ -160,23 +132,30 @@
         </w:trPr>
         <w:tc>
           <w:tcPr>
-            <w:tcW w:type="dxa" w:w="4048"/>
-            <w:tcBorders>
-              <w:top w:val="single" w:color="D5DCE2" w:sz="4"/>
-              <w:left w:val="single" w:color="D5DCE2" w:sz="4"/>
-              <w:bottom w:val="single" w:color="D5DCE2" w:sz="4"/>
-              <w:right w:val="single" w:color="D5DCE2" w:sz="4"/>
-            </w:tcBorders>
-            <w:tcMar>
-              <w:top w:type="dxa" w:w="70"/>
-              <w:left w:type="dxa" w:w="110"/>
-              <w:bottom w:type="dxa" w:w="70"/>
-              <w:right w:type="dxa" w:w="110"/>
-            </w:tcMar>
-          </w:tcPr>
-          <w:p>
-            <w:r>
-              <w:t xml:space="preserve">First-time setup: creates the first admin. Works </w:t>
+            <w:tcW w:type="dxa" w:w="3470"/>
+            <w:tcBorders>
+              <w:top w:val="single" w:color="D5DCE2" w:sz="4"/>
+              <w:left w:val="single" w:color="D5DCE2" w:sz="4"/>
+              <w:bottom w:val="single" w:color="D5DCE2" w:sz="4"/>
+              <w:right w:val="single" w:color="D5DCE2" w:sz="4"/>
+            </w:tcBorders>
+            <w:tcMar>
+              <w:top w:type="dxa" w:w="70"/>
+              <w:left w:type="dxa" w:w="110"/>
+              <w:bottom w:type="dxa" w:w="70"/>
+              <w:right w:type="dxa" w:w="110"/>
+            </w:tcMar>
+          </w:tcPr>
+          <w:p>
+            <w:r>
+              <w:rPr>
+                <w:b/>
+                <w:bCs/>
+              </w:rPr>
+              <w:t xml:space="preserve">First-time setup:</w:t>
+            </w:r>
+            <w:r>
+              <w:t xml:space="preserve"> creates the first admin (owner, </w:t>
             </w:r>
             <w:r>
               <w:rPr>
@@ -186,57 +165,37 @@
               <w:t xml:space="preserve">once only</w:t>
             </w:r>
             <w:r>
-              <w:t xml:space="preserve">.</w:t>
-            </w:r>
-          </w:p>
-        </w:tc>
-        <w:tc>
-          <w:tcPr>
-            <w:tcW w:type="dxa" w:w="4144"/>
-            <w:tcBorders>
-              <w:top w:val="single" w:color="D5DCE2" w:sz="4"/>
-              <w:left w:val="single" w:color="D5DCE2" w:sz="4"/>
-              <w:bottom w:val="single" w:color="D5DCE2" w:sz="4"/>
-              <w:right w:val="single" w:color="D5DCE2" w:sz="4"/>
-            </w:tcBorders>
-            <w:tcMar>
-              <w:top w:type="dxa" w:w="70"/>
-              <w:left w:type="dxa" w:w="110"/>
-              <w:bottom w:type="dxa" w:w="70"/>
-              <w:right w:type="dxa" w:w="110"/>
-            </w:tcMar>
-          </w:tcPr>
-          <w:p>
-            <w:r>
-              <w:rPr>
-                <w:b/>
-                <w:bCs/>
-                <w:highlight w:val="yellow"/>
-              </w:rPr>
-              <w:t xml:space="preserve">YOUR-LINK/setup</w:t>
-            </w:r>
-          </w:p>
-        </w:tc>
-        <w:tc>
-          <w:tcPr>
-            <w:tcW w:type="dxa" w:w="1446"/>
-            <w:tcBorders>
-              <w:top w:val="single" w:color="D5DCE2" w:sz="4"/>
-              <w:left w:val="single" w:color="D5DCE2" w:sz="4"/>
-              <w:bottom w:val="single" w:color="D5DCE2" w:sz="4"/>
-              <w:right w:val="single" w:color="D5DCE2" w:sz="4"/>
-            </w:tcBorders>
-            <w:tcMar>
-              <w:top w:type="dxa" w:w="70"/>
-              <w:left w:type="dxa" w:w="110"/>
-              <w:bottom w:type="dxa" w:w="70"/>
-              <w:right w:type="dxa" w:w="110"/>
-            </w:tcMar>
-          </w:tcPr>
-          <w:p>
-            <w:r>
-              <w:t xml:space="preserve">Owner</w:t>
-            </w:r>
+              <w:t xml:space="preserve">)</w:t>
+            </w:r>
+          </w:p>
+        </w:tc>
+        <w:tc>
+          <w:tcPr>
+            <w:tcW w:type="dxa" w:w="6168"/>
+            <w:tcBorders>
+              <w:top w:val="single" w:color="D5DCE2" w:sz="4"/>
+              <w:left w:val="single" w:color="D5DCE2" w:sz="4"/>
+              <w:bottom w:val="single" w:color="D5DCE2" w:sz="4"/>
+              <w:right w:val="single" w:color="D5DCE2" w:sz="4"/>
+            </w:tcBorders>
+            <w:tcMar>
+              <w:top w:type="dxa" w:w="70"/>
+              <w:left w:type="dxa" w:w="110"/>
+              <w:bottom w:type="dxa" w:w="70"/>
+              <w:right w:type="dxa" w:w="110"/>
+            </w:tcMar>
+          </w:tcPr>
+          <w:p>
+            <w:hyperlink w:history="1" r:id="rIdsodtiglcu4cpjci2p-xma">
+              <w:r>
+                <w:rPr>
+                  <w:rStyle w:val="Hyperlink"/>
+                  <w:sz w:val="18"/>
+                  <w:szCs w:val="18"/>
+                </w:rPr>
+                <w:t xml:space="preserve">https://sensoria-attendance.kinmenglim.workers.dev/setup</w:t>
+              </w:r>
+            </w:hyperlink>
           </w:p>
         </w:tc>
       </w:tr>
@@ -247,29 +206,7 @@
         </w:trPr>
         <w:tc>
           <w:tcPr>
-            <w:tcW w:type="dxa" w:w="4048"/>
-            <w:tcBorders>
-              <w:top w:val="single" w:color="D5DCE2" w:sz="4"/>
-              <w:left w:val="single" w:color="D5DCE2" w:sz="4"/>
-              <w:bottom w:val="single" w:color="D5DCE2" w:sz="4"/>
-              <w:right w:val="single" w:color="D5DCE2" w:sz="4"/>
-            </w:tcBorders>
-            <w:tcMar>
-              <w:top w:type="dxa" w:w="70"/>
-              <w:left w:type="dxa" w:w="110"/>
-              <w:bottom w:type="dxa" w:w="70"/>
-              <w:right w:type="dxa" w:w="110"/>
-            </w:tcMar>
-          </w:tcPr>
-          <w:p>
-            <w:r>
-              <w:t xml:space="preserve">Sign in (same page for everyone)</w:t>
-            </w:r>
-          </w:p>
-        </w:tc>
-        <w:tc>
-          <w:tcPr>
-            <w:tcW w:type="dxa" w:w="4144"/>
+            <w:tcW w:type="dxa" w:w="3470"/>
             <w:tcBorders>
               <w:top w:val="single" w:color="D5DCE2" w:sz="4"/>
               <w:left w:val="single" w:color="D5DCE2" w:sz="4"/>
@@ -288,32 +225,41 @@
               <w:rPr>
                 <w:b/>
                 <w:bCs/>
-                <w:highlight w:val="yellow"/>
               </w:rPr>
-              <w:t xml:space="preserve">YOUR-LINK/login</w:t>
-            </w:r>
-          </w:p>
-        </w:tc>
-        <w:tc>
-          <w:tcPr>
-            <w:tcW w:type="dxa" w:w="1446"/>
-            <w:tcBorders>
-              <w:top w:val="single" w:color="D5DCE2" w:sz="4"/>
-              <w:left w:val="single" w:color="D5DCE2" w:sz="4"/>
-              <w:bottom w:val="single" w:color="D5DCE2" w:sz="4"/>
-              <w:right w:val="single" w:color="D5DCE2" w:sz="4"/>
-            </w:tcBorders>
-            <w:tcMar>
-              <w:top w:type="dxa" w:w="70"/>
-              <w:left w:type="dxa" w:w="110"/>
-              <w:bottom w:type="dxa" w:w="70"/>
-              <w:right w:type="dxa" w:w="110"/>
-            </w:tcMar>
-          </w:tcPr>
-          <w:p>
-            <w:r>
-              <w:t xml:space="preserve">Everyone</w:t>
-            </w:r>
+              <w:t xml:space="preserve">Sign in:</w:t>
+            </w:r>
+            <w:r>
+              <w:t xml:space="preserve"> same page for everyone</w:t>
+            </w:r>
+          </w:p>
+        </w:tc>
+        <w:tc>
+          <w:tcPr>
+            <w:tcW w:type="dxa" w:w="6168"/>
+            <w:tcBorders>
+              <w:top w:val="single" w:color="D5DCE2" w:sz="4"/>
+              <w:left w:val="single" w:color="D5DCE2" w:sz="4"/>
+              <w:bottom w:val="single" w:color="D5DCE2" w:sz="4"/>
+              <w:right w:val="single" w:color="D5DCE2" w:sz="4"/>
+            </w:tcBorders>
+            <w:tcMar>
+              <w:top w:type="dxa" w:w="70"/>
+              <w:left w:type="dxa" w:w="110"/>
+              <w:bottom w:type="dxa" w:w="70"/>
+              <w:right w:type="dxa" w:w="110"/>
+            </w:tcMar>
+          </w:tcPr>
+          <w:p>
+            <w:hyperlink w:history="1" r:id="rIdhe8sb714fpc2_4vmzp0yv">
+              <w:r>
+                <w:rPr>
+                  <w:rStyle w:val="Hyperlink"/>
+                  <w:sz w:val="18"/>
+                  <w:szCs w:val="18"/>
+                </w:rPr>
+                <w:t xml:space="preserve">https://sensoria-attendance.kinmenglim.workers.dev/login</w:t>
+              </w:r>
+            </w:hyperlink>
           </w:p>
         </w:tc>
       </w:tr>
@@ -324,29 +270,7 @@
         </w:trPr>
         <w:tc>
           <w:tcPr>
-            <w:tcW w:type="dxa" w:w="4048"/>
-            <w:tcBorders>
-              <w:top w:val="single" w:color="D5DCE2" w:sz="4"/>
-              <w:left w:val="single" w:color="D5DCE2" w:sz="4"/>
-              <w:bottom w:val="single" w:color="D5DCE2" w:sz="4"/>
-              <w:right w:val="single" w:color="D5DCE2" w:sz="4"/>
-            </w:tcBorders>
-            <w:tcMar>
-              <w:top w:type="dxa" w:w="70"/>
-              <w:left w:type="dxa" w:w="110"/>
-              <w:bottom w:type="dxa" w:w="70"/>
-              <w:right w:type="dxa" w:w="110"/>
-            </w:tcMar>
-          </w:tcPr>
-          <w:p>
-            <w:r>
-              <w:t xml:space="preserve">Worker: clock in / out</w:t>
-            </w:r>
-          </w:p>
-        </w:tc>
-        <w:tc>
-          <w:tcPr>
-            <w:tcW w:type="dxa" w:w="4144"/>
+            <w:tcW w:type="dxa" w:w="3470"/>
             <w:tcBorders>
               <w:top w:val="single" w:color="D5DCE2" w:sz="4"/>
               <w:left w:val="single" w:color="D5DCE2" w:sz="4"/>
@@ -365,32 +289,41 @@
               <w:rPr>
                 <w:b/>
                 <w:bCs/>
-                <w:highlight w:val="yellow"/>
               </w:rPr>
-              <w:t xml:space="preserve">YOUR-LINK</w:t>
-            </w:r>
-          </w:p>
-        </w:tc>
-        <w:tc>
-          <w:tcPr>
-            <w:tcW w:type="dxa" w:w="1446"/>
-            <w:tcBorders>
-              <w:top w:val="single" w:color="D5DCE2" w:sz="4"/>
-              <w:left w:val="single" w:color="D5DCE2" w:sz="4"/>
-              <w:bottom w:val="single" w:color="D5DCE2" w:sz="4"/>
-              <w:right w:val="single" w:color="D5DCE2" w:sz="4"/>
-            </w:tcBorders>
-            <w:tcMar>
-              <w:top w:type="dxa" w:w="70"/>
-              <w:left w:type="dxa" w:w="110"/>
-              <w:bottom w:type="dxa" w:w="70"/>
-              <w:right w:type="dxa" w:w="110"/>
-            </w:tcMar>
-          </w:tcPr>
-          <w:p>
-            <w:r>
-              <w:t xml:space="preserve">Workers</w:t>
-            </w:r>
+              <w:t xml:space="preserve">Worker:</w:t>
+            </w:r>
+            <w:r>
+              <w:t xml:space="preserve"> clock in / out</w:t>
+            </w:r>
+          </w:p>
+        </w:tc>
+        <w:tc>
+          <w:tcPr>
+            <w:tcW w:type="dxa" w:w="6168"/>
+            <w:tcBorders>
+              <w:top w:val="single" w:color="D5DCE2" w:sz="4"/>
+              <w:left w:val="single" w:color="D5DCE2" w:sz="4"/>
+              <w:bottom w:val="single" w:color="D5DCE2" w:sz="4"/>
+              <w:right w:val="single" w:color="D5DCE2" w:sz="4"/>
+            </w:tcBorders>
+            <w:tcMar>
+              <w:top w:type="dxa" w:w="70"/>
+              <w:left w:type="dxa" w:w="110"/>
+              <w:bottom w:type="dxa" w:w="70"/>
+              <w:right w:type="dxa" w:w="110"/>
+            </w:tcMar>
+          </w:tcPr>
+          <w:p>
+            <w:hyperlink w:history="1" r:id="rIdas5mcgb0sdqpfia-7yzwk">
+              <w:r>
+                <w:rPr>
+                  <w:rStyle w:val="Hyperlink"/>
+                  <w:sz w:val="18"/>
+                  <w:szCs w:val="18"/>
+                </w:rPr>
+                <w:t xml:space="preserve">https://sensoria-attendance.kinmenglim.workers.dev</w:t>
+              </w:r>
+            </w:hyperlink>
           </w:p>
         </w:tc>
       </w:tr>
@@ -401,29 +334,7 @@
         </w:trPr>
         <w:tc>
           <w:tcPr>
-            <w:tcW w:type="dxa" w:w="4048"/>
-            <w:tcBorders>
-              <w:top w:val="single" w:color="D5DCE2" w:sz="4"/>
-              <w:left w:val="single" w:color="D5DCE2" w:sz="4"/>
-              <w:bottom w:val="single" w:color="D5DCE2" w:sz="4"/>
-              <w:right w:val="single" w:color="D5DCE2" w:sz="4"/>
-            </w:tcBorders>
-            <w:tcMar>
-              <w:top w:type="dxa" w:w="70"/>
-              <w:left w:type="dxa" w:w="110"/>
-              <w:bottom w:type="dxa" w:w="70"/>
-              <w:right w:type="dxa" w:w="110"/>
-            </w:tcMar>
-          </w:tcPr>
-          <w:p>
-            <w:r>
-              <w:t xml:space="preserve">Worker: my hours</w:t>
-            </w:r>
-          </w:p>
-        </w:tc>
-        <w:tc>
-          <w:tcPr>
-            <w:tcW w:type="dxa" w:w="4144"/>
+            <w:tcW w:type="dxa" w:w="3470"/>
             <w:tcBorders>
               <w:top w:val="single" w:color="D5DCE2" w:sz="4"/>
               <w:left w:val="single" w:color="D5DCE2" w:sz="4"/>
@@ -442,32 +353,41 @@
               <w:rPr>
                 <w:b/>
                 <w:bCs/>
-                <w:highlight w:val="yellow"/>
               </w:rPr>
-              <w:t xml:space="preserve">YOUR-LINK/me</w:t>
-            </w:r>
-          </w:p>
-        </w:tc>
-        <w:tc>
-          <w:tcPr>
-            <w:tcW w:type="dxa" w:w="1446"/>
-            <w:tcBorders>
-              <w:top w:val="single" w:color="D5DCE2" w:sz="4"/>
-              <w:left w:val="single" w:color="D5DCE2" w:sz="4"/>
-              <w:bottom w:val="single" w:color="D5DCE2" w:sz="4"/>
-              <w:right w:val="single" w:color="D5DCE2" w:sz="4"/>
-            </w:tcBorders>
-            <w:tcMar>
-              <w:top w:type="dxa" w:w="70"/>
-              <w:left w:type="dxa" w:w="110"/>
-              <w:bottom w:type="dxa" w:w="70"/>
-              <w:right w:type="dxa" w:w="110"/>
-            </w:tcMar>
-          </w:tcPr>
-          <w:p>
-            <w:r>
-              <w:t xml:space="preserve">Workers</w:t>
-            </w:r>
+              <w:t xml:space="preserve">Worker:</w:t>
+            </w:r>
+            <w:r>
+              <w:t xml:space="preserve"> my hours</w:t>
+            </w:r>
+          </w:p>
+        </w:tc>
+        <w:tc>
+          <w:tcPr>
+            <w:tcW w:type="dxa" w:w="6168"/>
+            <w:tcBorders>
+              <w:top w:val="single" w:color="D5DCE2" w:sz="4"/>
+              <w:left w:val="single" w:color="D5DCE2" w:sz="4"/>
+              <w:bottom w:val="single" w:color="D5DCE2" w:sz="4"/>
+              <w:right w:val="single" w:color="D5DCE2" w:sz="4"/>
+            </w:tcBorders>
+            <w:tcMar>
+              <w:top w:type="dxa" w:w="70"/>
+              <w:left w:type="dxa" w:w="110"/>
+              <w:bottom w:type="dxa" w:w="70"/>
+              <w:right w:type="dxa" w:w="110"/>
+            </w:tcMar>
+          </w:tcPr>
+          <w:p>
+            <w:hyperlink w:history="1" r:id="rIdvs3awwfcbxqj_7q6v0yfv">
+              <w:r>
+                <w:rPr>
+                  <w:rStyle w:val="Hyperlink"/>
+                  <w:sz w:val="18"/>
+                  <w:szCs w:val="18"/>
+                </w:rPr>
+                <w:t xml:space="preserve">https://sensoria-attendance.kinmenglim.workers.dev/me</w:t>
+              </w:r>
+            </w:hyperlink>
           </w:p>
         </w:tc>
       </w:tr>
@@ -478,29 +398,7 @@
         </w:trPr>
         <w:tc>
           <w:tcPr>
-            <w:tcW w:type="dxa" w:w="4048"/>
-            <w:tcBorders>
-              <w:top w:val="single" w:color="D5DCE2" w:sz="4"/>
-              <w:left w:val="single" w:color="D5DCE2" w:sz="4"/>
-              <w:bottom w:val="single" w:color="D5DCE2" w:sz="4"/>
-              <w:right w:val="single" w:color="D5DCE2" w:sz="4"/>
-            </w:tcBorders>
-            <w:tcMar>
-              <w:top w:type="dxa" w:w="70"/>
-              <w:left w:type="dxa" w:w="110"/>
-              <w:bottom w:type="dxa" w:w="70"/>
-              <w:right w:type="dxa" w:w="110"/>
-            </w:tcMar>
-          </w:tcPr>
-          <w:p>
-            <w:r>
-              <w:t xml:space="preserve">Admin dashboard (today)</w:t>
-            </w:r>
-          </w:p>
-        </w:tc>
-        <w:tc>
-          <w:tcPr>
-            <w:tcW w:type="dxa" w:w="4144"/>
+            <w:tcW w:type="dxa" w:w="3470"/>
             <w:tcBorders>
               <w:top w:val="single" w:color="D5DCE2" w:sz="4"/>
               <w:left w:val="single" w:color="D5DCE2" w:sz="4"/>
@@ -519,32 +417,41 @@
               <w:rPr>
                 <w:b/>
                 <w:bCs/>
-                <w:highlight w:val="yellow"/>
               </w:rPr>
-              <w:t xml:space="preserve">YOUR-LINK/admin</w:t>
-            </w:r>
-          </w:p>
-        </w:tc>
-        <w:tc>
-          <w:tcPr>
-            <w:tcW w:type="dxa" w:w="1446"/>
-            <w:tcBorders>
-              <w:top w:val="single" w:color="D5DCE2" w:sz="4"/>
-              <w:left w:val="single" w:color="D5DCE2" w:sz="4"/>
-              <w:bottom w:val="single" w:color="D5DCE2" w:sz="4"/>
-              <w:right w:val="single" w:color="D5DCE2" w:sz="4"/>
-            </w:tcBorders>
-            <w:tcMar>
-              <w:top w:type="dxa" w:w="70"/>
-              <w:left w:type="dxa" w:w="110"/>
-              <w:bottom w:type="dxa" w:w="70"/>
-              <w:right w:type="dxa" w:w="110"/>
-            </w:tcMar>
-          </w:tcPr>
-          <w:p>
-            <w:r>
-              <w:t xml:space="preserve">Admins</w:t>
-            </w:r>
+              <w:t xml:space="preserve">Admin:</w:t>
+            </w:r>
+            <w:r>
+              <w:t xml:space="preserve"> dashboard (today)</w:t>
+            </w:r>
+          </w:p>
+        </w:tc>
+        <w:tc>
+          <w:tcPr>
+            <w:tcW w:type="dxa" w:w="6168"/>
+            <w:tcBorders>
+              <w:top w:val="single" w:color="D5DCE2" w:sz="4"/>
+              <w:left w:val="single" w:color="D5DCE2" w:sz="4"/>
+              <w:bottom w:val="single" w:color="D5DCE2" w:sz="4"/>
+              <w:right w:val="single" w:color="D5DCE2" w:sz="4"/>
+            </w:tcBorders>
+            <w:tcMar>
+              <w:top w:type="dxa" w:w="70"/>
+              <w:left w:type="dxa" w:w="110"/>
+              <w:bottom w:type="dxa" w:w="70"/>
+              <w:right w:type="dxa" w:w="110"/>
+            </w:tcMar>
+          </w:tcPr>
+          <w:p>
+            <w:hyperlink w:history="1" r:id="rId0w1sx1mt-g204dsbnowbw">
+              <w:r>
+                <w:rPr>
+                  <w:rStyle w:val="Hyperlink"/>
+                  <w:sz w:val="18"/>
+                  <w:szCs w:val="18"/>
+                </w:rPr>
+                <w:t xml:space="preserve">https://sensoria-attendance.kinmenglim.workers.dev/admin</w:t>
+              </w:r>
+            </w:hyperlink>
           </w:p>
         </w:tc>
       </w:tr>
@@ -555,29 +462,7 @@
         </w:trPr>
         <w:tc>
           <w:tcPr>
-            <w:tcW w:type="dxa" w:w="4048"/>
-            <w:tcBorders>
-              <w:top w:val="single" w:color="D5DCE2" w:sz="4"/>
-              <w:left w:val="single" w:color="D5DCE2" w:sz="4"/>
-              <w:bottom w:val="single" w:color="D5DCE2" w:sz="4"/>
-              <w:right w:val="single" w:color="D5DCE2" w:sz="4"/>
-            </w:tcBorders>
-            <w:tcMar>
-              <w:top w:type="dxa" w:w="70"/>
-              <w:left w:type="dxa" w:w="110"/>
-              <w:bottom w:type="dxa" w:w="70"/>
-              <w:right w:type="dxa" w:w="110"/>
-            </w:tcMar>
-          </w:tcPr>
-          <w:p>
-            <w:r>
-              <w:t xml:space="preserve">Approvals (all pending)</w:t>
-            </w:r>
-          </w:p>
-        </w:tc>
-        <w:tc>
-          <w:tcPr>
-            <w:tcW w:type="dxa" w:w="4144"/>
+            <w:tcW w:type="dxa" w:w="3470"/>
             <w:tcBorders>
               <w:top w:val="single" w:color="D5DCE2" w:sz="4"/>
               <w:left w:val="single" w:color="D5DCE2" w:sz="4"/>
@@ -596,32 +481,41 @@
               <w:rPr>
                 <w:b/>
                 <w:bCs/>
-                <w:highlight w:val="yellow"/>
               </w:rPr>
-              <w:t xml:space="preserve">YOUR-LINK/admin/pending</w:t>
-            </w:r>
-          </w:p>
-        </w:tc>
-        <w:tc>
-          <w:tcPr>
-            <w:tcW w:type="dxa" w:w="1446"/>
-            <w:tcBorders>
-              <w:top w:val="single" w:color="D5DCE2" w:sz="4"/>
-              <w:left w:val="single" w:color="D5DCE2" w:sz="4"/>
-              <w:bottom w:val="single" w:color="D5DCE2" w:sz="4"/>
-              <w:right w:val="single" w:color="D5DCE2" w:sz="4"/>
-            </w:tcBorders>
-            <w:tcMar>
-              <w:top w:type="dxa" w:w="70"/>
-              <w:left w:type="dxa" w:w="110"/>
-              <w:bottom w:type="dxa" w:w="70"/>
-              <w:right w:type="dxa" w:w="110"/>
-            </w:tcMar>
-          </w:tcPr>
-          <w:p>
-            <w:r>
-              <w:t xml:space="preserve">Admins</w:t>
-            </w:r>
+              <w:t xml:space="preserve">Admin:</w:t>
+            </w:r>
+            <w:r>
+              <w:t xml:space="preserve"> approvals (all pending)</w:t>
+            </w:r>
+          </w:p>
+        </w:tc>
+        <w:tc>
+          <w:tcPr>
+            <w:tcW w:type="dxa" w:w="6168"/>
+            <w:tcBorders>
+              <w:top w:val="single" w:color="D5DCE2" w:sz="4"/>
+              <w:left w:val="single" w:color="D5DCE2" w:sz="4"/>
+              <w:bottom w:val="single" w:color="D5DCE2" w:sz="4"/>
+              <w:right w:val="single" w:color="D5DCE2" w:sz="4"/>
+            </w:tcBorders>
+            <w:tcMar>
+              <w:top w:type="dxa" w:w="70"/>
+              <w:left w:type="dxa" w:w="110"/>
+              <w:bottom w:type="dxa" w:w="70"/>
+              <w:right w:type="dxa" w:w="110"/>
+            </w:tcMar>
+          </w:tcPr>
+          <w:p>
+            <w:hyperlink w:history="1" r:id="rIdqmducn72f5bk4mlzzavjb">
+              <w:r>
+                <w:rPr>
+                  <w:rStyle w:val="Hyperlink"/>
+                  <w:sz w:val="18"/>
+                  <w:szCs w:val="18"/>
+                </w:rPr>
+                <w:t xml:space="preserve">https://sensoria-attendance.kinmenglim.workers.dev/admin/pending</w:t>
+              </w:r>
+            </w:hyperlink>
           </w:p>
         </w:tc>
       </w:tr>
@@ -632,29 +526,7 @@
         </w:trPr>
         <w:tc>
           <w:tcPr>
-            <w:tcW w:type="dxa" w:w="4048"/>
-            <w:tcBorders>
-              <w:top w:val="single" w:color="D5DCE2" w:sz="4"/>
-              <w:left w:val="single" w:color="D5DCE2" w:sz="4"/>
-              <w:bottom w:val="single" w:color="D5DCE2" w:sz="4"/>
-              <w:right w:val="single" w:color="D5DCE2" w:sz="4"/>
-            </w:tcBorders>
-            <w:tcMar>
-              <w:top w:type="dxa" w:w="70"/>
-              <w:left w:type="dxa" w:w="110"/>
-              <w:bottom w:type="dxa" w:w="70"/>
-              <w:right w:type="dxa" w:w="110"/>
-            </w:tcMar>
-          </w:tcPr>
-          <w:p>
-            <w:r>
-              <w:t xml:space="preserve">People: add accounts, reset PINs</w:t>
-            </w:r>
-          </w:p>
-        </w:tc>
-        <w:tc>
-          <w:tcPr>
-            <w:tcW w:type="dxa" w:w="4144"/>
+            <w:tcW w:type="dxa" w:w="3470"/>
             <w:tcBorders>
               <w:top w:val="single" w:color="D5DCE2" w:sz="4"/>
               <w:left w:val="single" w:color="D5DCE2" w:sz="4"/>
@@ -673,32 +545,41 @@
               <w:rPr>
                 <w:b/>
                 <w:bCs/>
-                <w:highlight w:val="yellow"/>
               </w:rPr>
-              <w:t xml:space="preserve">YOUR-LINK/admin/people</w:t>
-            </w:r>
-          </w:p>
-        </w:tc>
-        <w:tc>
-          <w:tcPr>
-            <w:tcW w:type="dxa" w:w="1446"/>
-            <w:tcBorders>
-              <w:top w:val="single" w:color="D5DCE2" w:sz="4"/>
-              <w:left w:val="single" w:color="D5DCE2" w:sz="4"/>
-              <w:bottom w:val="single" w:color="D5DCE2" w:sz="4"/>
-              <w:right w:val="single" w:color="D5DCE2" w:sz="4"/>
-            </w:tcBorders>
-            <w:tcMar>
-              <w:top w:type="dxa" w:w="70"/>
-              <w:left w:type="dxa" w:w="110"/>
-              <w:bottom w:type="dxa" w:w="70"/>
-              <w:right w:type="dxa" w:w="110"/>
-            </w:tcMar>
-          </w:tcPr>
-          <w:p>
-            <w:r>
-              <w:t xml:space="preserve">Admins</w:t>
-            </w:r>
+              <w:t xml:space="preserve">Admin:</w:t>
+            </w:r>
+            <w:r>
+              <w:t xml:space="preserve"> people, add accounts, reset PINs</w:t>
+            </w:r>
+          </w:p>
+        </w:tc>
+        <w:tc>
+          <w:tcPr>
+            <w:tcW w:type="dxa" w:w="6168"/>
+            <w:tcBorders>
+              <w:top w:val="single" w:color="D5DCE2" w:sz="4"/>
+              <w:left w:val="single" w:color="D5DCE2" w:sz="4"/>
+              <w:bottom w:val="single" w:color="D5DCE2" w:sz="4"/>
+              <w:right w:val="single" w:color="D5DCE2" w:sz="4"/>
+            </w:tcBorders>
+            <w:tcMar>
+              <w:top w:type="dxa" w:w="70"/>
+              <w:left w:type="dxa" w:w="110"/>
+              <w:bottom w:type="dxa" w:w="70"/>
+              <w:right w:type="dxa" w:w="110"/>
+            </w:tcMar>
+          </w:tcPr>
+          <w:p>
+            <w:hyperlink w:history="1" r:id="rId7j8izfmxunvkpa4cnyz-a">
+              <w:r>
+                <w:rPr>
+                  <w:rStyle w:val="Hyperlink"/>
+                  <w:sz w:val="18"/>
+                  <w:szCs w:val="18"/>
+                </w:rPr>
+                <w:t xml:space="preserve">https://sensoria-attendance.kinmenglim.workers.dev/admin/people</w:t>
+              </w:r>
+            </w:hyperlink>
           </w:p>
         </w:tc>
       </w:tr>
@@ -709,29 +590,7 @@
         </w:trPr>
         <w:tc>
           <w:tcPr>
-            <w:tcW w:type="dxa" w:w="4048"/>
-            <w:tcBorders>
-              <w:top w:val="single" w:color="D5DCE2" w:sz="4"/>
-              <w:left w:val="single" w:color="D5DCE2" w:sz="4"/>
-              <w:bottom w:val="single" w:color="D5DCE2" w:sz="4"/>
-              <w:right w:val="single" w:color="D5DCE2" w:sz="4"/>
-            </w:tcBorders>
-            <w:tcMar>
-              <w:top w:type="dxa" w:w="70"/>
-              <w:left w:type="dxa" w:w="110"/>
-              <w:bottom w:type="dxa" w:w="70"/>
-              <w:right w:type="dxa" w:w="110"/>
-            </w:tcMar>
-          </w:tcPr>
-          <w:p>
-            <w:r>
-              <w:t xml:space="preserve">Monthly export (CSV)</w:t>
-            </w:r>
-          </w:p>
-        </w:tc>
-        <w:tc>
-          <w:tcPr>
-            <w:tcW w:type="dxa" w:w="4144"/>
+            <w:tcW w:type="dxa" w:w="3470"/>
             <w:tcBorders>
               <w:top w:val="single" w:color="D5DCE2" w:sz="4"/>
               <w:left w:val="single" w:color="D5DCE2" w:sz="4"/>
@@ -750,32 +609,41 @@
               <w:rPr>
                 <w:b/>
                 <w:bCs/>
-                <w:highlight w:val="yellow"/>
               </w:rPr>
-              <w:t xml:space="preserve">YOUR-LINK/admin/export</w:t>
-            </w:r>
-          </w:p>
-        </w:tc>
-        <w:tc>
-          <w:tcPr>
-            <w:tcW w:type="dxa" w:w="1446"/>
-            <w:tcBorders>
-              <w:top w:val="single" w:color="D5DCE2" w:sz="4"/>
-              <w:left w:val="single" w:color="D5DCE2" w:sz="4"/>
-              <w:bottom w:val="single" w:color="D5DCE2" w:sz="4"/>
-              <w:right w:val="single" w:color="D5DCE2" w:sz="4"/>
-            </w:tcBorders>
-            <w:tcMar>
-              <w:top w:type="dxa" w:w="70"/>
-              <w:left w:type="dxa" w:w="110"/>
-              <w:bottom w:type="dxa" w:w="70"/>
-              <w:right w:type="dxa" w:w="110"/>
-            </w:tcMar>
-          </w:tcPr>
-          <w:p>
-            <w:r>
-              <w:t xml:space="preserve">Admins</w:t>
-            </w:r>
+              <w:t xml:space="preserve">Admin:</w:t>
+            </w:r>
+            <w:r>
+              <w:t xml:space="preserve"> monthly export (CSV)</w:t>
+            </w:r>
+          </w:p>
+        </w:tc>
+        <w:tc>
+          <w:tcPr>
+            <w:tcW w:type="dxa" w:w="6168"/>
+            <w:tcBorders>
+              <w:top w:val="single" w:color="D5DCE2" w:sz="4"/>
+              <w:left w:val="single" w:color="D5DCE2" w:sz="4"/>
+              <w:bottom w:val="single" w:color="D5DCE2" w:sz="4"/>
+              <w:right w:val="single" w:color="D5DCE2" w:sz="4"/>
+            </w:tcBorders>
+            <w:tcMar>
+              <w:top w:type="dxa" w:w="70"/>
+              <w:left w:type="dxa" w:w="110"/>
+              <w:bottom w:type="dxa" w:w="70"/>
+              <w:right w:type="dxa" w:w="110"/>
+            </w:tcMar>
+          </w:tcPr>
+          <w:p>
+            <w:hyperlink w:history="1" r:id="rIdvatpjfxuj1rslpxjoivsh">
+              <w:r>
+                <w:rPr>
+                  <w:rStyle w:val="Hyperlink"/>
+                  <w:sz w:val="18"/>
+                  <w:szCs w:val="18"/>
+                </w:rPr>
+                <w:t xml:space="preserve">https://sensoria-attendance.kinmenglim.workers.dev/admin/export</w:t>
+              </w:r>
+            </w:hyperlink>
           </w:p>
         </w:tc>
       </w:tr>
@@ -786,29 +654,7 @@
         </w:trPr>
         <w:tc>
           <w:tcPr>
-            <w:tcW w:type="dxa" w:w="4048"/>
-            <w:tcBorders>
-              <w:top w:val="single" w:color="D5DCE2" w:sz="4"/>
-              <w:left w:val="single" w:color="D5DCE2" w:sz="4"/>
-              <w:bottom w:val="single" w:color="D5DCE2" w:sz="4"/>
-              <w:right w:val="single" w:color="D5DCE2" w:sz="4"/>
-            </w:tcBorders>
-            <w:tcMar>
-              <w:top w:type="dxa" w:w="70"/>
-              <w:left w:type="dxa" w:w="110"/>
-              <w:bottom w:type="dxa" w:w="70"/>
-              <w:right w:type="dxa" w:w="110"/>
-            </w:tcMar>
-          </w:tcPr>
-          <w:p>
-            <w:r>
-              <w:t xml:space="preserve">Settings and work sites</w:t>
-            </w:r>
-          </w:p>
-        </w:tc>
-        <w:tc>
-          <w:tcPr>
-            <w:tcW w:type="dxa" w:w="4144"/>
+            <w:tcW w:type="dxa" w:w="3470"/>
             <w:tcBorders>
               <w:top w:val="single" w:color="D5DCE2" w:sz="4"/>
               <w:left w:val="single" w:color="D5DCE2" w:sz="4"/>
@@ -827,32 +673,41 @@
               <w:rPr>
                 <w:b/>
                 <w:bCs/>
-                <w:highlight w:val="yellow"/>
               </w:rPr>
-              <w:t xml:space="preserve">YOUR-LINK/admin/settings</w:t>
-            </w:r>
-          </w:p>
-        </w:tc>
-        <w:tc>
-          <w:tcPr>
-            <w:tcW w:type="dxa" w:w="1446"/>
-            <w:tcBorders>
-              <w:top w:val="single" w:color="D5DCE2" w:sz="4"/>
-              <w:left w:val="single" w:color="D5DCE2" w:sz="4"/>
-              <w:bottom w:val="single" w:color="D5DCE2" w:sz="4"/>
-              <w:right w:val="single" w:color="D5DCE2" w:sz="4"/>
-            </w:tcBorders>
-            <w:tcMar>
-              <w:top w:type="dxa" w:w="70"/>
-              <w:left w:type="dxa" w:w="110"/>
-              <w:bottom w:type="dxa" w:w="70"/>
-              <w:right w:type="dxa" w:w="110"/>
-            </w:tcMar>
-          </w:tcPr>
-          <w:p>
-            <w:r>
-              <w:t xml:space="preserve">Admins</w:t>
-            </w:r>
+              <w:t xml:space="preserve">Admin:</w:t>
+            </w:r>
+            <w:r>
+              <w:t xml:space="preserve"> settings and work sites</w:t>
+            </w:r>
+          </w:p>
+        </w:tc>
+        <w:tc>
+          <w:tcPr>
+            <w:tcW w:type="dxa" w:w="6168"/>
+            <w:tcBorders>
+              <w:top w:val="single" w:color="D5DCE2" w:sz="4"/>
+              <w:left w:val="single" w:color="D5DCE2" w:sz="4"/>
+              <w:bottom w:val="single" w:color="D5DCE2" w:sz="4"/>
+              <w:right w:val="single" w:color="D5DCE2" w:sz="4"/>
+            </w:tcBorders>
+            <w:tcMar>
+              <w:top w:type="dxa" w:w="70"/>
+              <w:left w:type="dxa" w:w="110"/>
+              <w:bottom w:type="dxa" w:w="70"/>
+              <w:right w:type="dxa" w:w="110"/>
+            </w:tcMar>
+          </w:tcPr>
+          <w:p>
+            <w:hyperlink w:history="1" r:id="rIdx1mwehpo5_yohfnvd_psg">
+              <w:r>
+                <w:rPr>
+                  <w:rStyle w:val="Hyperlink"/>
+                  <w:sz w:val="18"/>
+                  <w:szCs w:val="18"/>
+                </w:rPr>
+                <w:t xml:space="preserve">https://sensoria-attendance.kinmenglim.workers.dev/admin/settings</w:t>
+              </w:r>
+            </w:hyperlink>
           </w:p>
         </w:tc>
       </w:tr>
@@ -910,14 +765,14 @@
       <w:r>
         <w:t xml:space="preserve">Open </w:t>
       </w:r>
-      <w:r>
-        <w:rPr>
-          <w:b/>
-          <w:bCs/>
-          <w:highlight w:val="yellow"/>
-        </w:rPr>
-        <w:t xml:space="preserve">YOUR-LINK/setup</w:t>
-      </w:r>
+      <w:hyperlink w:history="1" r:id="rIdeinm70y9qkq53ytd08om7">
+        <w:r>
+          <w:rPr>
+            <w:rStyle w:val="Hyperlink"/>
+          </w:rPr>
+          <w:t xml:space="preserve">https://sensoria-attendance.kinmenglim.workers.dev/setup</w:t>
+        </w:r>
+      </w:hyperlink>
       <w:r>
         <w:t xml:space="preserve"> and create your admin account (username + password of 8 or more characters).</w:t>
       </w:r>
@@ -1858,14 +1713,14 @@
             <w:r>
               <w:t xml:space="preserve">Hi [name], here’s our attendance app: </w:t>
             </w:r>
-            <w:r>
-              <w:rPr>
-                <w:b/>
-                <w:bCs/>
-                <w:highlight w:val="yellow"/>
-              </w:rPr>
-              <w:t xml:space="preserve">YOUR-LINK</w:t>
-            </w:r>
+            <w:hyperlink w:history="1" r:id="rIdesrrix-3p_k9u0h34jpou">
+              <w:r>
+                <w:rPr>
+                  <w:rStyle w:val="Hyperlink"/>
+                </w:rPr>
+                <w:t xml:space="preserve">https://sensoria-attendance.kinmenglim.workers.dev</w:t>
+              </w:r>
+            </w:hyperlink>
           </w:p>
           <w:p>
             <w:pPr>

</xml_diff>